<commit_message>
Add more final exams question
</commit_message>
<xml_diff>
--- a/SZZ/Státnice.docx
+++ b/SZZ/Státnice.docx
@@ -88,85 +88,100 @@
     <w:p>
       <w:pPr>
         <w:pStyle w:val="Odrkovtext"/>
-        <w:rPr>
-          <w:color w:val="ADADAD" w:themeColor="background2" w:themeShade="BF"/>
-        </w:rPr>
       </w:pPr>
       <w:r>
-        <w:rPr>
-          <w:color w:val="ADADAD" w:themeColor="background2" w:themeShade="BF"/>
-        </w:rPr>
         <w:t>Diferenciální a integrální počet funkcí jedné proměnné (definice derivace funkce a její geometrický význam, primitivní funkce, určitý integrál a jeho geometrický význam), numerické derivování a integrace (obdélníkové, lichoběžníkové a </w:t>
       </w:r>
       <w:proofErr w:type="spellStart"/>
       <w:r>
-        <w:rPr>
-          <w:color w:val="ADADAD" w:themeColor="background2" w:themeShade="BF"/>
-        </w:rPr>
         <w:t>Simpsonovo</w:t>
       </w:r>
       <w:proofErr w:type="spellEnd"/>
       <w:r>
-        <w:rPr>
-          <w:color w:val="ADADAD" w:themeColor="background2" w:themeShade="BF"/>
-        </w:rPr>
         <w:t xml:space="preserve"> pravidlo), aplikace (určení lokálního extrému, navazování křivek, objem rotačního tělesa)</w:t>
       </w:r>
     </w:p>
     <w:p>
       <w:pPr>
         <w:pStyle w:val="Odrkovtext"/>
+        <w:rPr>
+          <w:color w:val="A6A6A6" w:themeColor="background1" w:themeShade="A6"/>
+        </w:rPr>
       </w:pPr>
       <w:r>
+        <w:rPr>
+          <w:color w:val="A6A6A6" w:themeColor="background1" w:themeShade="A6"/>
+        </w:rPr>
         <w:t>Soustava lineárních rovnic (definice, řešitelnost a </w:t>
       </w:r>
       <w:proofErr w:type="spellStart"/>
       <w:r>
+        <w:rPr>
+          <w:color w:val="A6A6A6" w:themeColor="background1" w:themeShade="A6"/>
+        </w:rPr>
         <w:t>Frobeniova</w:t>
       </w:r>
       <w:proofErr w:type="spellEnd"/>
       <w:r>
+        <w:rPr>
+          <w:color w:val="A6A6A6" w:themeColor="background1" w:themeShade="A6"/>
+        </w:rPr>
         <w:t xml:space="preserve"> věta, metody řešení [</w:t>
       </w:r>
       <w:proofErr w:type="spellStart"/>
       <w:r>
+        <w:rPr>
+          <w:color w:val="A6A6A6" w:themeColor="background1" w:themeShade="A6"/>
+        </w:rPr>
         <w:t>Cramerovo</w:t>
       </w:r>
       <w:proofErr w:type="spellEnd"/>
       <w:r>
+        <w:rPr>
+          <w:color w:val="A6A6A6" w:themeColor="background1" w:themeShade="A6"/>
+        </w:rPr>
         <w:t xml:space="preserve"> pravidlo, Gaussova eliminační metoda, metoda LU rozkladu, </w:t>
       </w:r>
       <w:proofErr w:type="spellStart"/>
       <w:r>
+        <w:rPr>
+          <w:color w:val="A6A6A6" w:themeColor="background1" w:themeShade="A6"/>
+        </w:rPr>
         <w:t>Jacobiho</w:t>
       </w:r>
       <w:proofErr w:type="spellEnd"/>
       <w:r>
+        <w:rPr>
+          <w:color w:val="A6A6A6" w:themeColor="background1" w:themeShade="A6"/>
+        </w:rPr>
         <w:t xml:space="preserve"> a Gaussova</w:t>
       </w:r>
       <w:r>
+        <w:rPr>
+          <w:color w:val="A6A6A6" w:themeColor="background1" w:themeShade="A6"/>
+        </w:rPr>
         <w:noBreakHyphen/>
       </w:r>
       <w:proofErr w:type="spellStart"/>
       <w:r>
+        <w:rPr>
+          <w:color w:val="A6A6A6" w:themeColor="background1" w:themeShade="A6"/>
+        </w:rPr>
         <w:t>Seidelova</w:t>
       </w:r>
       <w:proofErr w:type="spellEnd"/>
       <w:r>
+        <w:rPr>
+          <w:color w:val="A6A6A6" w:themeColor="background1" w:themeShade="A6"/>
+        </w:rPr>
         <w:t xml:space="preserve"> iterační metoda]), aplikace (např. při řešení obvodů stejnosměrného proudu)</w:t>
       </w:r>
     </w:p>
     <w:p>
       <w:pPr>
         <w:pStyle w:val="Odrkovtext"/>
-        <w:rPr>
-          <w:color w:val="ADADAD" w:themeColor="background2" w:themeShade="BF"/>
-        </w:rPr>
       </w:pPr>
       <w:r>
-        <w:rPr>
-          <w:color w:val="ADADAD" w:themeColor="background2" w:themeShade="BF"/>
-        </w:rPr>
         <w:t>Reálná funkce více reálných proměnných (definice, definiční obor a obor hodnot, graf funkce dvou proměnných, parciální derivace, lokální, vázané a globální extrémy), aproximace metodou nejmenších čtverců (motivace a geometrický význam, formulace, řešení, aplikace na nelineární funkce např. v elektronice)</w:t>
       </w:r>
     </w:p>
@@ -189,8 +204,14 @@
     <w:p>
       <w:pPr>
         <w:pStyle w:val="Odrkovtext"/>
+        <w:rPr>
+          <w:color w:val="A6A6A6" w:themeColor="background1" w:themeShade="A6"/>
+        </w:rPr>
       </w:pPr>
       <w:r>
+        <w:rPr>
+          <w:color w:val="A6A6A6" w:themeColor="background1" w:themeShade="A6"/>
+        </w:rPr>
         <w:t>Intervaly spolehlivosti, jejich význam, interpretace a konstrukce (definice, typy, interpretace spolehlivosti, resp. hladiny významnosti, výpočet [pro střední hodnotu, rozptyl, relativní četnost], vliv rozsahu výběru, využití v praxi)</w:t>
       </w:r>
     </w:p>

</xml_diff>

<commit_message>
Update final exams questions (SZZ)
</commit_message>
<xml_diff>
--- a/SZZ/Státnice.docx
+++ b/SZZ/Státnice.docx
@@ -180,8 +180,14 @@
     <w:p>
       <w:pPr>
         <w:pStyle w:val="Odrkovtext"/>
+        <w:rPr>
+          <w:color w:val="A6A6A6" w:themeColor="background1" w:themeShade="A6"/>
+        </w:rPr>
       </w:pPr>
       <w:r>
+        <w:rPr>
+          <w:color w:val="A6A6A6" w:themeColor="background1" w:themeShade="A6"/>
+        </w:rPr>
         <w:t>Reálná funkce více reálných proměnných (definice, definiční obor a obor hodnot, graf funkce dvou proměnných, parciální derivace, lokální, vázané a globální extrémy), aproximace metodou nejmenších čtverců (motivace a geometrický význam, formulace, řešení, aplikace na nelineární funkce např. v elektronice)</w:t>
       </w:r>
     </w:p>
@@ -204,14 +210,8 @@
     <w:p>
       <w:pPr>
         <w:pStyle w:val="Odrkovtext"/>
-        <w:rPr>
-          <w:color w:val="A6A6A6" w:themeColor="background1" w:themeShade="A6"/>
-        </w:rPr>
       </w:pPr>
       <w:r>
-        <w:rPr>
-          <w:color w:val="A6A6A6" w:themeColor="background1" w:themeShade="A6"/>
-        </w:rPr>
         <w:t>Intervaly spolehlivosti, jejich význam, interpretace a konstrukce (definice, typy, interpretace spolehlivosti, resp. hladiny významnosti, výpočet [pro střední hodnotu, rozptyl, relativní četnost], vliv rozsahu výběru, využití v praxi)</w:t>
       </w:r>
     </w:p>
@@ -490,7 +490,6 @@
             </w:pPr>
             <w:r>
               <w:rPr>
-                <w:color w:val="ADADAD" w:themeColor="background2" w:themeShade="BF"/>
                 <w:sz w:val="20"/>
                 <w:szCs w:val="20"/>
               </w:rPr>
@@ -511,11 +510,18 @@
             </w:pPr>
             <w:r>
               <w:rPr>
-                <w:color w:val="ADADAD" w:themeColor="background2" w:themeShade="BF"/>
-                <w:sz w:val="20"/>
-                <w:szCs w:val="20"/>
-              </w:rPr>
-              <w:t>2</w:t>
+                <w:sz w:val="20"/>
+                <w:szCs w:val="20"/>
+              </w:rPr>
+              <w:t>1</w:t>
+            </w:r>
+            <w:r>
+              <w:rPr>
+                <w:color w:val="A6A6A6" w:themeColor="background1" w:themeShade="A6"/>
+                <w:sz w:val="20"/>
+                <w:szCs w:val="20"/>
+              </w:rPr>
+              <w:t>/2</w:t>
             </w:r>
           </w:p>
         </w:tc>
@@ -557,7 +563,15 @@
                 <w:sz w:val="20"/>
                 <w:szCs w:val="20"/>
               </w:rPr>
-              <w:t>2</w:t>
+              <w:t>1</w:t>
+            </w:r>
+            <w:r>
+              <w:rPr>
+                <w:color w:val="A6A6A6" w:themeColor="background1" w:themeShade="A6"/>
+                <w:sz w:val="20"/>
+                <w:szCs w:val="20"/>
+              </w:rPr>
+              <w:t>/2</w:t>
             </w:r>
           </w:p>
         </w:tc>

</xml_diff>